<commit_message>
updated Black Deck Template
</commit_message>
<xml_diff>
--- a/CAtC/CAtC_BLACK-CARDS_Template.docx
+++ b/CAtC/CAtC_BLACK-CARDS_Template.docx
@@ -127,7 +127,23 @@
           <w:rFonts w:ascii="Arial" w:eastAsia="Arial" w:hAnsi="Arial" w:cs="Arial"/>
           <w:color w:val="1A1A1A"/>
         </w:rPr>
-        <w:t>This is the starter kit for making your own black cards. Same 2.5 by 3.5 inch card size as the real deck, same footer, same rules, just empty. A couple of sample pages are still in here so you can see the format before you delete them and start typing your own trauma.</w:t>
+        <w:t xml:space="preserve">This is the starter kit for making your own black cards. Same 2.5 by </w:t>
+      </w:r>
+      <w:proofErr w:type="gramStart"/>
+      <w:r>
+        <w:rPr>
+          <w:rFonts w:ascii="Arial" w:eastAsia="Arial" w:hAnsi="Arial" w:cs="Arial"/>
+          <w:color w:val="1A1A1A"/>
+        </w:rPr>
+        <w:t>3.5 inch</w:t>
+      </w:r>
+      <w:proofErr w:type="gramEnd"/>
+      <w:r>
+        <w:rPr>
+          <w:rFonts w:ascii="Arial" w:eastAsia="Arial" w:hAnsi="Arial" w:cs="Arial"/>
+          <w:color w:val="1A1A1A"/>
+        </w:rPr>
+        <w:t xml:space="preserve"> card size as the real deck, same footer, same rules, just empty. A couple of sample pages are still in here so you can see the format before you delete them and start typing your own trauma.</w:t>
       </w:r>
     </w:p>
     <w:p>
@@ -155,7 +171,23 @@
           <w:rFonts w:ascii="Arial" w:eastAsia="Arial" w:hAnsi="Arial" w:cs="Arial"/>
           <w:color w:val="1A1A1A"/>
         </w:rPr>
-        <w:t>A black card asks a question or sets up a fill in the blank. Keep it short enough to read out loud in one breath, and specific enough that half the table winces before you finish the sentence. "Cloud costs are bad" is not a joke. "Why is the bill $80,000 this month?" is.</w:t>
+        <w:t xml:space="preserve">A black card asks a question or sets up a fill in the blank. Keep it short enough to read out loud in one breath, and </w:t>
+      </w:r>
+      <w:proofErr w:type="gramStart"/>
+      <w:r>
+        <w:rPr>
+          <w:rFonts w:ascii="Arial" w:eastAsia="Arial" w:hAnsi="Arial" w:cs="Arial"/>
+          <w:color w:val="1A1A1A"/>
+        </w:rPr>
+        <w:t>specific</w:t>
+      </w:r>
+      <w:proofErr w:type="gramEnd"/>
+      <w:r>
+        <w:rPr>
+          <w:rFonts w:ascii="Arial" w:eastAsia="Arial" w:hAnsi="Arial" w:cs="Arial"/>
+          <w:color w:val="1A1A1A"/>
+        </w:rPr>
+        <w:t xml:space="preserve"> enough that half the table winces before you finish the sentence. "Cloud costs are bad" is not a joke. "Why is the bill $80,000 this month?" is.</w:t>
       </w:r>
     </w:p>
     <w:p>
@@ -167,7 +199,23 @@
           <w:rFonts w:ascii="Arial" w:eastAsia="Arial" w:hAnsi="Arial" w:cs="Arial"/>
           <w:color w:val="1A1A1A"/>
         </w:rPr>
-        <w:t>Blanks are exactly seven underscores, like this. _______. Count how many blanks are on the card and that is your Pick number. One blank is Pick 1, two blanks is Pick 2. Most good cards only need one.</w:t>
+        <w:t xml:space="preserve">Blanks are exactly seven underscores, like this. _______. Count how many blanks are on the card and that is your Pick number. One blank is Pick 1, two blanks </w:t>
+      </w:r>
+      <w:proofErr w:type="gramStart"/>
+      <w:r>
+        <w:rPr>
+          <w:rFonts w:ascii="Arial" w:eastAsia="Arial" w:hAnsi="Arial" w:cs="Arial"/>
+          <w:color w:val="1A1A1A"/>
+        </w:rPr>
+        <w:t>is</w:t>
+      </w:r>
+      <w:proofErr w:type="gramEnd"/>
+      <w:r>
+        <w:rPr>
+          <w:rFonts w:ascii="Arial" w:eastAsia="Arial" w:hAnsi="Arial" w:cs="Arial"/>
+          <w:color w:val="1A1A1A"/>
+        </w:rPr>
+        <w:t xml:space="preserve"> Pick 2. Most good cards only need one.</w:t>
       </w:r>
     </w:p>
     <w:p>
@@ -260,7 +308,31 @@
           <w:sz w:val="23"/>
           <w:szCs w:val="23"/>
         </w:rPr>
-        <w:t>Add the Pick number</w:t>
+        <w:t xml:space="preserve">Add </w:t>
+      </w:r>
+      <w:proofErr w:type="gramStart"/>
+      <w:r>
+        <w:rPr>
+          <w:rFonts w:ascii="Arial" w:eastAsia="Arial" w:hAnsi="Arial" w:cs="Arial"/>
+          <w:b/>
+          <w:bCs/>
+          <w:color w:val="000000"/>
+          <w:sz w:val="23"/>
+          <w:szCs w:val="23"/>
+        </w:rPr>
+        <w:t>the Pick</w:t>
+      </w:r>
+      <w:proofErr w:type="gramEnd"/>
+      <w:r>
+        <w:rPr>
+          <w:rFonts w:ascii="Arial" w:eastAsia="Arial" w:hAnsi="Arial" w:cs="Arial"/>
+          <w:b/>
+          <w:bCs/>
+          <w:color w:val="000000"/>
+          <w:sz w:val="23"/>
+          <w:szCs w:val="23"/>
+        </w:rPr>
+        <w:t xml:space="preserve"> number</w:t>
       </w:r>
     </w:p>
     <w:p>
@@ -272,7 +344,23 @@
           <w:rFonts w:ascii="Arial" w:eastAsia="Arial" w:hAnsi="Arial" w:cs="Arial"/>
           <w:color w:val="1A1A1A"/>
         </w:rPr>
-        <w:t>Type PICK 2 or PICK 3 in the bottom right corner to match your blank count. Leave it off for a single blank card. Getting this wrong is the one way to actually break the game, so double check it before you print four hundred copies.</w:t>
+        <w:t xml:space="preserve">Type PICK 2 or PICK 3 in the bottom right corner to match your blank count. Leave it off for a single blank card. Getting this wrong is the one way to </w:t>
+      </w:r>
+      <w:proofErr w:type="gramStart"/>
+      <w:r>
+        <w:rPr>
+          <w:rFonts w:ascii="Arial" w:eastAsia="Arial" w:hAnsi="Arial" w:cs="Arial"/>
+          <w:color w:val="1A1A1A"/>
+        </w:rPr>
+        <w:t>actually break</w:t>
+      </w:r>
+      <w:proofErr w:type="gramEnd"/>
+      <w:r>
+        <w:rPr>
+          <w:rFonts w:ascii="Arial" w:eastAsia="Arial" w:hAnsi="Arial" w:cs="Arial"/>
+          <w:color w:val="1A1A1A"/>
+        </w:rPr>
+        <w:t xml:space="preserve"> the game, so double check it before you print four hundred copies.</w:t>
       </w:r>
     </w:p>
     <w:p>
@@ -326,7 +414,23 @@
           <w:rFonts w:ascii="Arial" w:eastAsia="Arial" w:hAnsi="Arial" w:cs="Arial"/>
           <w:color w:val="1A1A1A"/>
         </w:rPr>
-        <w:t>This template carries the same Creative Commons Attribution 4.0 license as the rest of the game. Build your own expansion, print it for your team, sell it if you want. Just credit Geisersoft, link to the license, and say what you changed. Full terms are in the Instructions document.</w:t>
+        <w:t xml:space="preserve">This template carries the same Creative Commons Attribution 4.0 license as the rest of the game. Build your own expansion, print it for your team, sell it if you want. Just credit </w:t>
+      </w:r>
+      <w:proofErr w:type="spellStart"/>
+      <w:r>
+        <w:rPr>
+          <w:rFonts w:ascii="Arial" w:eastAsia="Arial" w:hAnsi="Arial" w:cs="Arial"/>
+          <w:color w:val="1A1A1A"/>
+        </w:rPr>
+        <w:t>Geisersoft</w:t>
+      </w:r>
+      <w:proofErr w:type="spellEnd"/>
+      <w:r>
+        <w:rPr>
+          <w:rFonts w:ascii="Arial" w:eastAsia="Arial" w:hAnsi="Arial" w:cs="Arial"/>
+          <w:color w:val="1A1A1A"/>
+        </w:rPr>
+        <w:t>, link to the license, and say what you changed. Full terms are in the Instructions document.</w:t>
       </w:r>
     </w:p>
     <w:p>
@@ -936,12 +1040,18 @@
                 <w:left w:w="10" w:type="dxa"/>
                 <w:right w:w="10" w:type="dxa"/>
               </w:tblCellMar>
-              <w:tblLook w:val="04A0" w:firstRow="1" w:lastRow="0" w:firstColumn="1" w:lastColumn="0" w:noHBand="0" w:noVBand="1"/>
+              <w:tblLook w:val="0000" w:firstRow="0" w:lastRow="0" w:firstColumn="0" w:lastColumn="0" w:noHBand="0" w:noVBand="0"/>
             </w:tblPr>
             <w:tblGrid>
               <w:gridCol w:w="3600"/>
             </w:tblGrid>
             <w:tr>
+              <w:tblPrEx>
+                <w:tblCellMar>
+                  <w:top w:w="0" w:type="dxa"/>
+                  <w:bottom w:w="0" w:type="dxa"/>
+                </w:tblCellMar>
+              </w:tblPrEx>
               <w:trPr>
                 <w:trHeight w:hRule="exact" w:val="4130"/>
               </w:trPr>
@@ -972,15 +1082,21 @@
                       <w:b/>
                       <w:bCs/>
                       <w:color w:val="FFFFFF"/>
-                      <w:sz w:val="27"/>
-                      <w:szCs w:val="27"/>
-                    </w:rPr>
-                    <w:t>Our disaster recovery plan is just _______.</w:t>
+                      <w:sz w:val="24"/>
+                      <w:szCs w:val="24"/>
+                    </w:rPr>
+                    <w:t>The postmortem timeline: 02:14 _______. 02:15 _______.</w:t>
                   </w:r>
                 </w:p>
               </w:tc>
             </w:tr>
             <w:tr>
+              <w:tblPrEx>
+                <w:tblCellMar>
+                  <w:top w:w="0" w:type="dxa"/>
+                  <w:bottom w:w="0" w:type="dxa"/>
+                </w:tblCellMar>
+              </w:tblPrEx>
               <w:trPr>
                 <w:trHeight w:hRule="exact" w:val="910"/>
               </w:trPr>
@@ -1013,10 +1129,10 @@
                       <w:noProof/>
                     </w:rPr>
                     <w:drawing>
-                      <wp:inline distT="0" distB="0" distL="0" distR="0" wp14:anchorId="567443FE" wp14:editId="45613D24">
+                      <wp:inline distT="0" distB="0" distL="0" distR="0" wp14:anchorId="273023AA" wp14:editId="7CD506B2">
                         <wp:extent cx="276225" cy="276225"/>
                         <wp:effectExtent l="0" t="0" r="0" b="0"/>
-                        <wp:docPr id="1477214467" name="Picture 1477214467"/>
+                        <wp:docPr id="440778486" name="Picture 440778486"/>
                         <wp:cNvGraphicFramePr>
                           <a:graphicFrameLocks xmlns:a="http://schemas.openxmlformats.org/drawingml/2006/main" noChangeAspect="1"/>
                         </wp:cNvGraphicFramePr>
@@ -1069,6 +1185,20 @@
                       <w:szCs w:val="12"/>
                     </w:rPr>
                     <w:t>CARDS AGAINST THE CLOUD</w:t>
+                  </w:r>
+                  <w:r>
+                    <w:tab/>
+                  </w:r>
+                  <w:r>
+                    <w:rPr>
+                      <w:rFonts w:ascii="Arial" w:eastAsia="Arial" w:hAnsi="Arial" w:cs="Arial"/>
+                      <w:b/>
+                      <w:bCs/>
+                      <w:color w:val="FFFFFF"/>
+                      <w:sz w:val="16"/>
+                      <w:szCs w:val="16"/>
+                    </w:rPr>
+                    <w:t>PICK 2</w:t>
                   </w:r>
                 </w:p>
               </w:tc>
@@ -1109,12 +1239,18 @@
                 <w:left w:w="10" w:type="dxa"/>
                 <w:right w:w="10" w:type="dxa"/>
               </w:tblCellMar>
-              <w:tblLook w:val="04A0" w:firstRow="1" w:lastRow="0" w:firstColumn="1" w:lastColumn="0" w:noHBand="0" w:noVBand="1"/>
+              <w:tblLook w:val="0000" w:firstRow="0" w:lastRow="0" w:firstColumn="0" w:lastColumn="0" w:noHBand="0" w:noVBand="0"/>
             </w:tblPr>
             <w:tblGrid>
               <w:gridCol w:w="3600"/>
             </w:tblGrid>
             <w:tr>
+              <w:tblPrEx>
+                <w:tblCellMar>
+                  <w:top w:w="0" w:type="dxa"/>
+                  <w:bottom w:w="0" w:type="dxa"/>
+                </w:tblCellMar>
+              </w:tblPrEx>
               <w:trPr>
                 <w:trHeight w:hRule="exact" w:val="4130"/>
               </w:trPr>
@@ -1145,15 +1281,45 @@
                       <w:b/>
                       <w:bCs/>
                       <w:color w:val="FFFFFF"/>
-                      <w:sz w:val="27"/>
-                      <w:szCs w:val="27"/>
-                    </w:rPr>
-                    <w:t>What did the CISO find in the S3 bucket?</w:t>
+                      <w:sz w:val="22"/>
+                      <w:szCs w:val="22"/>
+                    </w:rPr>
+                    <w:t xml:space="preserve">The </w:t>
+                  </w:r>
+                  <w:proofErr w:type="gramStart"/>
+                  <w:r>
+                    <w:rPr>
+                      <w:rFonts w:ascii="Arial" w:eastAsia="Arial" w:hAnsi="Arial" w:cs="Arial"/>
+                      <w:b/>
+                      <w:bCs/>
+                      <w:color w:val="FFFFFF"/>
+                      <w:sz w:val="22"/>
+                      <w:szCs w:val="22"/>
+                    </w:rPr>
+                    <w:t>job posting</w:t>
+                  </w:r>
+                  <w:proofErr w:type="gramEnd"/>
+                  <w:r>
+                    <w:rPr>
+                      <w:rFonts w:ascii="Arial" w:eastAsia="Arial" w:hAnsi="Arial" w:cs="Arial"/>
+                      <w:b/>
+                      <w:bCs/>
+                      <w:color w:val="FFFFFF"/>
+                      <w:sz w:val="22"/>
+                      <w:szCs w:val="22"/>
+                    </w:rPr>
+                    <w:t xml:space="preserve"> requires ten years of _______ and a passion for _______.</w:t>
                   </w:r>
                 </w:p>
               </w:tc>
             </w:tr>
             <w:tr>
+              <w:tblPrEx>
+                <w:tblCellMar>
+                  <w:top w:w="0" w:type="dxa"/>
+                  <w:bottom w:w="0" w:type="dxa"/>
+                </w:tblCellMar>
+              </w:tblPrEx>
               <w:trPr>
                 <w:trHeight w:hRule="exact" w:val="910"/>
               </w:trPr>
@@ -1186,10 +1352,10 @@
                       <w:noProof/>
                     </w:rPr>
                     <w:drawing>
-                      <wp:inline distT="0" distB="0" distL="0" distR="0" wp14:anchorId="3E736E10" wp14:editId="6D522970">
+                      <wp:inline distT="0" distB="0" distL="0" distR="0" wp14:anchorId="413029FF" wp14:editId="6FC7E7C3">
                         <wp:extent cx="276225" cy="276225"/>
                         <wp:effectExtent l="0" t="0" r="0" b="0"/>
-                        <wp:docPr id="2025427904" name="Picture 2025427904"/>
+                        <wp:docPr id="1079978741" name="Picture 1079978741"/>
                         <wp:cNvGraphicFramePr>
                           <a:graphicFrameLocks xmlns:a="http://schemas.openxmlformats.org/drawingml/2006/main" noChangeAspect="1"/>
                         </wp:cNvGraphicFramePr>
@@ -1242,6 +1408,20 @@
                       <w:szCs w:val="12"/>
                     </w:rPr>
                     <w:t>CARDS AGAINST THE CLOUD</w:t>
+                  </w:r>
+                  <w:r>
+                    <w:tab/>
+                  </w:r>
+                  <w:r>
+                    <w:rPr>
+                      <w:rFonts w:ascii="Arial" w:eastAsia="Arial" w:hAnsi="Arial" w:cs="Arial"/>
+                      <w:b/>
+                      <w:bCs/>
+                      <w:color w:val="FFFFFF"/>
+                      <w:sz w:val="16"/>
+                      <w:szCs w:val="16"/>
+                    </w:rPr>
+                    <w:t>PICK 2</w:t>
                   </w:r>
                 </w:p>
               </w:tc>
@@ -1282,12 +1462,18 @@
                 <w:left w:w="10" w:type="dxa"/>
                 <w:right w:w="10" w:type="dxa"/>
               </w:tblCellMar>
-              <w:tblLook w:val="04A0" w:firstRow="1" w:lastRow="0" w:firstColumn="1" w:lastColumn="0" w:noHBand="0" w:noVBand="1"/>
+              <w:tblLook w:val="0000" w:firstRow="0" w:lastRow="0" w:firstColumn="0" w:lastColumn="0" w:noHBand="0" w:noVBand="0"/>
             </w:tblPr>
             <w:tblGrid>
               <w:gridCol w:w="3600"/>
             </w:tblGrid>
             <w:tr>
+              <w:tblPrEx>
+                <w:tblCellMar>
+                  <w:top w:w="0" w:type="dxa"/>
+                  <w:bottom w:w="0" w:type="dxa"/>
+                </w:tblCellMar>
+              </w:tblPrEx>
               <w:trPr>
                 <w:trHeight w:hRule="exact" w:val="4130"/>
               </w:trPr>
@@ -1318,15 +1504,21 @@
                       <w:b/>
                       <w:bCs/>
                       <w:color w:val="FFFFFF"/>
-                      <w:sz w:val="30"/>
-                      <w:szCs w:val="30"/>
-                    </w:rPr>
-                    <w:t>What's in my Terraform state file?</w:t>
+                      <w:sz w:val="24"/>
+                      <w:szCs w:val="24"/>
+                    </w:rPr>
+                    <w:t>Nothing says "enterprise ready" like _______ and _______.</w:t>
                   </w:r>
                 </w:p>
               </w:tc>
             </w:tr>
             <w:tr>
+              <w:tblPrEx>
+                <w:tblCellMar>
+                  <w:top w:w="0" w:type="dxa"/>
+                  <w:bottom w:w="0" w:type="dxa"/>
+                </w:tblCellMar>
+              </w:tblPrEx>
               <w:trPr>
                 <w:trHeight w:hRule="exact" w:val="910"/>
               </w:trPr>
@@ -1359,10 +1551,10 @@
                       <w:noProof/>
                     </w:rPr>
                     <w:drawing>
-                      <wp:inline distT="0" distB="0" distL="0" distR="0" wp14:anchorId="040C8E6D" wp14:editId="70C08BE4">
+                      <wp:inline distT="0" distB="0" distL="0" distR="0" wp14:anchorId="46E40B17" wp14:editId="358A4FEA">
                         <wp:extent cx="276225" cy="276225"/>
                         <wp:effectExtent l="0" t="0" r="0" b="0"/>
-                        <wp:docPr id="1307427661" name="Picture 1307427661"/>
+                        <wp:docPr id="518034737" name="Picture 518034737"/>
                         <wp:cNvGraphicFramePr>
                           <a:graphicFrameLocks xmlns:a="http://schemas.openxmlformats.org/drawingml/2006/main" noChangeAspect="1"/>
                         </wp:cNvGraphicFramePr>
@@ -1416,6 +1608,20 @@
                     </w:rPr>
                     <w:t>CARDS AGAINST THE CLOUD</w:t>
                   </w:r>
+                  <w:r>
+                    <w:tab/>
+                  </w:r>
+                  <w:r>
+                    <w:rPr>
+                      <w:rFonts w:ascii="Arial" w:eastAsia="Arial" w:hAnsi="Arial" w:cs="Arial"/>
+                      <w:b/>
+                      <w:bCs/>
+                      <w:color w:val="FFFFFF"/>
+                      <w:sz w:val="16"/>
+                      <w:szCs w:val="16"/>
+                    </w:rPr>
+                    <w:t>PICK 2</w:t>
+                  </w:r>
                 </w:p>
               </w:tc>
             </w:tr>
@@ -1446,7 +1652,7 @@
           </w:tcPr>
           <w:tbl>
             <w:tblPr>
-              <w:tblW w:w="3600" w:type="dxa"/>
+              <w:tblW w:w="7110" w:type="dxa"/>
               <w:tblBorders>
                 <w:top w:val="none" w:sz="0" w:space="0" w:color="FFFFFF"/>
                 <w:left w:val="none" w:sz="0" w:space="0" w:color="FFFFFF"/>
@@ -1463,12 +1669,50 @@
               <w:tblLook w:val="04A0" w:firstRow="1" w:lastRow="0" w:firstColumn="1" w:lastColumn="0" w:noHBand="0" w:noVBand="1"/>
             </w:tblPr>
             <w:tblGrid>
+              <w:gridCol w:w="3510"/>
               <w:gridCol w:w="3600"/>
             </w:tblGrid>
             <w:tr>
               <w:trPr>
                 <w:trHeight w:hRule="exact" w:val="4130"/>
               </w:trPr>
+              <w:tc>
+                <w:tcPr>
+                  <w:tcW w:w="3510" w:type="dxa"/>
+                  <w:tcBorders>
+                    <w:top w:val="none" w:sz="0" w:space="0" w:color="FFFFFF"/>
+                    <w:left w:val="none" w:sz="0" w:space="0" w:color="FFFFFF"/>
+                    <w:bottom w:val="none" w:sz="0" w:space="0" w:color="FFFFFF"/>
+                    <w:right w:val="none" w:sz="0" w:space="0" w:color="FFFFFF"/>
+                  </w:tcBorders>
+                  <w:shd w:val="clear" w:color="auto" w:fill="000000"/>
+                </w:tcPr>
+                <w:p>
+                  <w:pPr>
+                    <w:spacing w:line="264" w:lineRule="auto"/>
+                    <w:ind w:left="180"/>
+                    <w:rPr>
+                      <w:rFonts w:ascii="Arial" w:eastAsia="Arial" w:hAnsi="Arial" w:cs="Arial"/>
+                      <w:b/>
+                      <w:bCs/>
+                      <w:color w:val="FFFFFF"/>
+                      <w:sz w:val="30"/>
+                      <w:szCs w:val="30"/>
+                    </w:rPr>
+                  </w:pPr>
+                  <w:r>
+                    <w:rPr>
+                      <w:rFonts w:ascii="Arial" w:eastAsia="Arial" w:hAnsi="Arial" w:cs="Arial"/>
+                      <w:b/>
+                      <w:bCs/>
+                      <w:color w:val="FFFFFF"/>
+                      <w:sz w:val="22"/>
+                      <w:szCs w:val="22"/>
+                    </w:rPr>
+                    <w:t>The vendor promised _______, delivered _______, and invoiced us for _______.</w:t>
+                  </w:r>
+                </w:p>
+              </w:tc>
               <w:tc>
                 <w:tcPr>
                   <w:tcW w:w="3600" w:type="dxa"/>
@@ -1508,6 +1752,105 @@
               <w:trPr>
                 <w:trHeight w:hRule="exact" w:val="910"/>
               </w:trPr>
+              <w:tc>
+                <w:tcPr>
+                  <w:tcW w:w="3510" w:type="dxa"/>
+                  <w:tcBorders>
+                    <w:top w:val="none" w:sz="0" w:space="0" w:color="FFFFFF"/>
+                    <w:left w:val="none" w:sz="0" w:space="0" w:color="FFFFFF"/>
+                    <w:bottom w:val="none" w:sz="0" w:space="0" w:color="FFFFFF"/>
+                    <w:right w:val="none" w:sz="0" w:space="0" w:color="FFFFFF"/>
+                  </w:tcBorders>
+                  <w:shd w:val="clear" w:color="auto" w:fill="000000"/>
+                  <w:vAlign w:val="bottom"/>
+                </w:tcPr>
+                <w:p>
+                  <w:pPr>
+                    <w:tabs>
+                      <w:tab w:val="right" w:pos="3220"/>
+                    </w:tabs>
+                    <w:rPr>
+                      <w:noProof/>
+                    </w:rPr>
+                  </w:pPr>
+                  <w:r>
+                    <w:rPr>
+                      <w:noProof/>
+                    </w:rPr>
+                    <w:drawing>
+                      <wp:inline distT="0" distB="0" distL="0" distR="0" wp14:anchorId="0D0017A9" wp14:editId="579853C8">
+                        <wp:extent cx="276225" cy="276225"/>
+                        <wp:effectExtent l="0" t="0" r="0" b="0"/>
+                        <wp:docPr id="678627972" name="Picture 678627972"/>
+                        <wp:cNvGraphicFramePr>
+                          <a:graphicFrameLocks xmlns:a="http://schemas.openxmlformats.org/drawingml/2006/main" noChangeAspect="1"/>
+                        </wp:cNvGraphicFramePr>
+                        <a:graphic xmlns:a="http://schemas.openxmlformats.org/drawingml/2006/main">
+                          <a:graphicData uri="http://schemas.openxmlformats.org/drawingml/2006/picture">
+                            <pic:pic xmlns:pic="http://schemas.openxmlformats.org/drawingml/2006/picture">
+                              <pic:nvPicPr>
+                                <pic:cNvPr id="0" name=""/>
+                                <pic:cNvPicPr>
+                                  <a:picLocks noChangeAspect="1" noChangeArrowheads="1"/>
+                                </pic:cNvPicPr>
+                              </pic:nvPicPr>
+                              <pic:blipFill>
+                                <a:blip r:embed="rId5"/>
+                                <a:srcRect/>
+                                <a:stretch>
+                                  <a:fillRect/>
+                                </a:stretch>
+                              </pic:blipFill>
+                              <pic:spPr bwMode="auto">
+                                <a:xfrm>
+                                  <a:off x="0" y="0"/>
+                                  <a:ext cx="276225" cy="276225"/>
+                                </a:xfrm>
+                                <a:prstGeom prst="rect">
+                                  <a:avLst/>
+                                </a:prstGeom>
+                              </pic:spPr>
+                            </pic:pic>
+                          </a:graphicData>
+                        </a:graphic>
+                      </wp:inline>
+                    </w:drawing>
+                  </w:r>
+                  <w:r>
+                    <w:rPr>
+                      <w:rFonts w:ascii="Arial" w:eastAsia="Arial" w:hAnsi="Arial" w:cs="Arial"/>
+                      <w:sz w:val="13"/>
+                      <w:szCs w:val="13"/>
+                    </w:rPr>
+                    <w:t xml:space="preserve">  </w:t>
+                  </w:r>
+                  <w:r>
+                    <w:rPr>
+                      <w:rFonts w:ascii="Arial" w:eastAsia="Arial" w:hAnsi="Arial" w:cs="Arial"/>
+                      <w:b/>
+                      <w:bCs/>
+                      <w:color w:val="B0B0B0"/>
+                      <w:sz w:val="12"/>
+                      <w:szCs w:val="12"/>
+                    </w:rPr>
+                    <w:t>CARDS AGAINST THE CLOUD</w:t>
+                  </w:r>
+                  <w:r>
+                    <w:tab/>
+                  </w:r>
+                  <w:r>
+                    <w:rPr>
+                      <w:rFonts w:ascii="Arial" w:eastAsia="Arial" w:hAnsi="Arial" w:cs="Arial"/>
+                      <w:b/>
+                      <w:bCs/>
+                      <w:color w:val="FFFFFF"/>
+                      <w:sz w:val="16"/>
+                      <w:szCs w:val="16"/>
+                    </w:rPr>
+                    <w:t>PICK 3</w:t>
+                  </w:r>
+                </w:p>
+              </w:tc>
               <w:tc>
                 <w:tcPr>
                   <w:tcW w:w="3600" w:type="dxa"/>
@@ -1619,7 +1962,7 @@
           </w:tcPr>
           <w:tbl>
             <w:tblPr>
-              <w:tblW w:w="3600" w:type="dxa"/>
+              <w:tblW w:w="7020" w:type="dxa"/>
               <w:tblBorders>
                 <w:top w:val="none" w:sz="0" w:space="0" w:color="FFFFFF"/>
                 <w:left w:val="none" w:sz="0" w:space="0" w:color="FFFFFF"/>
@@ -1636,12 +1979,50 @@
               <w:tblLook w:val="04A0" w:firstRow="1" w:lastRow="0" w:firstColumn="1" w:lastColumn="0" w:noHBand="0" w:noVBand="1"/>
             </w:tblPr>
             <w:tblGrid>
+              <w:gridCol w:w="3420"/>
               <w:gridCol w:w="3600"/>
             </w:tblGrid>
             <w:tr>
               <w:trPr>
                 <w:trHeight w:hRule="exact" w:val="4130"/>
               </w:trPr>
+              <w:tc>
+                <w:tcPr>
+                  <w:tcW w:w="3420" w:type="dxa"/>
+                  <w:tcBorders>
+                    <w:top w:val="none" w:sz="0" w:space="0" w:color="FFFFFF"/>
+                    <w:left w:val="none" w:sz="0" w:space="0" w:color="FFFFFF"/>
+                    <w:bottom w:val="none" w:sz="0" w:space="0" w:color="FFFFFF"/>
+                    <w:right w:val="none" w:sz="0" w:space="0" w:color="FFFFFF"/>
+                  </w:tcBorders>
+                  <w:shd w:val="clear" w:color="auto" w:fill="000000"/>
+                </w:tcPr>
+                <w:p>
+                  <w:pPr>
+                    <w:spacing w:line="264" w:lineRule="auto"/>
+                    <w:ind w:left="180"/>
+                    <w:rPr>
+                      <w:rFonts w:ascii="Arial" w:eastAsia="Arial" w:hAnsi="Arial" w:cs="Arial"/>
+                      <w:b/>
+                      <w:bCs/>
+                      <w:color w:val="FFFFFF"/>
+                      <w:sz w:val="24"/>
+                      <w:szCs w:val="24"/>
+                    </w:rPr>
+                  </w:pPr>
+                  <w:r>
+                    <w:rPr>
+                      <w:rFonts w:ascii="Arial" w:eastAsia="Arial" w:hAnsi="Arial" w:cs="Arial"/>
+                      <w:b/>
+                      <w:bCs/>
+                      <w:color w:val="FFFFFF"/>
+                      <w:sz w:val="22"/>
+                      <w:szCs w:val="22"/>
+                    </w:rPr>
+                    <w:t>The vendor promised _______, delivered _______, and invoiced us for _______.</w:t>
+                  </w:r>
+                </w:p>
+              </w:tc>
               <w:tc>
                 <w:tcPr>
                   <w:tcW w:w="3600" w:type="dxa"/>
@@ -1681,6 +2062,105 @@
               <w:trPr>
                 <w:trHeight w:hRule="exact" w:val="910"/>
               </w:trPr>
+              <w:tc>
+                <w:tcPr>
+                  <w:tcW w:w="3420" w:type="dxa"/>
+                  <w:tcBorders>
+                    <w:top w:val="none" w:sz="0" w:space="0" w:color="FFFFFF"/>
+                    <w:left w:val="none" w:sz="0" w:space="0" w:color="FFFFFF"/>
+                    <w:bottom w:val="none" w:sz="0" w:space="0" w:color="FFFFFF"/>
+                    <w:right w:val="none" w:sz="0" w:space="0" w:color="FFFFFF"/>
+                  </w:tcBorders>
+                  <w:shd w:val="clear" w:color="auto" w:fill="000000"/>
+                  <w:vAlign w:val="bottom"/>
+                </w:tcPr>
+                <w:p>
+                  <w:pPr>
+                    <w:tabs>
+                      <w:tab w:val="right" w:pos="3220"/>
+                    </w:tabs>
+                    <w:rPr>
+                      <w:noProof/>
+                    </w:rPr>
+                  </w:pPr>
+                  <w:r>
+                    <w:rPr>
+                      <w:noProof/>
+                    </w:rPr>
+                    <w:drawing>
+                      <wp:inline distT="0" distB="0" distL="0" distR="0" wp14:anchorId="4D9FB230" wp14:editId="0283B68E">
+                        <wp:extent cx="276225" cy="276225"/>
+                        <wp:effectExtent l="0" t="0" r="0" b="0"/>
+                        <wp:docPr id="357867807" name="Picture 357867807"/>
+                        <wp:cNvGraphicFramePr>
+                          <a:graphicFrameLocks xmlns:a="http://schemas.openxmlformats.org/drawingml/2006/main" noChangeAspect="1"/>
+                        </wp:cNvGraphicFramePr>
+                        <a:graphic xmlns:a="http://schemas.openxmlformats.org/drawingml/2006/main">
+                          <a:graphicData uri="http://schemas.openxmlformats.org/drawingml/2006/picture">
+                            <pic:pic xmlns:pic="http://schemas.openxmlformats.org/drawingml/2006/picture">
+                              <pic:nvPicPr>
+                                <pic:cNvPr id="0" name=""/>
+                                <pic:cNvPicPr>
+                                  <a:picLocks noChangeAspect="1" noChangeArrowheads="1"/>
+                                </pic:cNvPicPr>
+                              </pic:nvPicPr>
+                              <pic:blipFill>
+                                <a:blip r:embed="rId5"/>
+                                <a:srcRect/>
+                                <a:stretch>
+                                  <a:fillRect/>
+                                </a:stretch>
+                              </pic:blipFill>
+                              <pic:spPr bwMode="auto">
+                                <a:xfrm>
+                                  <a:off x="0" y="0"/>
+                                  <a:ext cx="276225" cy="276225"/>
+                                </a:xfrm>
+                                <a:prstGeom prst="rect">
+                                  <a:avLst/>
+                                </a:prstGeom>
+                              </pic:spPr>
+                            </pic:pic>
+                          </a:graphicData>
+                        </a:graphic>
+                      </wp:inline>
+                    </w:drawing>
+                  </w:r>
+                  <w:r>
+                    <w:rPr>
+                      <w:rFonts w:ascii="Arial" w:eastAsia="Arial" w:hAnsi="Arial" w:cs="Arial"/>
+                      <w:sz w:val="13"/>
+                      <w:szCs w:val="13"/>
+                    </w:rPr>
+                    <w:t xml:space="preserve">  </w:t>
+                  </w:r>
+                  <w:r>
+                    <w:rPr>
+                      <w:rFonts w:ascii="Arial" w:eastAsia="Arial" w:hAnsi="Arial" w:cs="Arial"/>
+                      <w:b/>
+                      <w:bCs/>
+                      <w:color w:val="B0B0B0"/>
+                      <w:sz w:val="12"/>
+                      <w:szCs w:val="12"/>
+                    </w:rPr>
+                    <w:t>CARDS AGAINST THE CLOUD</w:t>
+                  </w:r>
+                  <w:r>
+                    <w:tab/>
+                  </w:r>
+                  <w:r>
+                    <w:rPr>
+                      <w:rFonts w:ascii="Arial" w:eastAsia="Arial" w:hAnsi="Arial" w:cs="Arial"/>
+                      <w:b/>
+                      <w:bCs/>
+                      <w:color w:val="FFFFFF"/>
+                      <w:sz w:val="16"/>
+                      <w:szCs w:val="16"/>
+                    </w:rPr>
+                    <w:t>PICK 3</w:t>
+                  </w:r>
+                </w:p>
+              </w:tc>
               <w:tc>
                 <w:tcPr>
                   <w:tcW w:w="3600" w:type="dxa"/>
@@ -1792,7 +2272,7 @@
           </w:tcPr>
           <w:tbl>
             <w:tblPr>
-              <w:tblW w:w="3600" w:type="dxa"/>
+              <w:tblW w:w="7200" w:type="dxa"/>
               <w:tblBorders>
                 <w:top w:val="none" w:sz="0" w:space="0" w:color="FFFFFF"/>
                 <w:left w:val="none" w:sz="0" w:space="0" w:color="FFFFFF"/>
@@ -1810,11 +2290,49 @@
             </w:tblPr>
             <w:tblGrid>
               <w:gridCol w:w="3600"/>
+              <w:gridCol w:w="3600"/>
             </w:tblGrid>
             <w:tr>
               <w:trPr>
                 <w:trHeight w:hRule="exact" w:val="4130"/>
               </w:trPr>
+              <w:tc>
+                <w:tcPr>
+                  <w:tcW w:w="3600" w:type="dxa"/>
+                  <w:tcBorders>
+                    <w:top w:val="none" w:sz="0" w:space="0" w:color="FFFFFF"/>
+                    <w:left w:val="none" w:sz="0" w:space="0" w:color="FFFFFF"/>
+                    <w:bottom w:val="none" w:sz="0" w:space="0" w:color="FFFFFF"/>
+                    <w:right w:val="none" w:sz="0" w:space="0" w:color="FFFFFF"/>
+                  </w:tcBorders>
+                  <w:shd w:val="clear" w:color="auto" w:fill="000000"/>
+                </w:tcPr>
+                <w:p>
+                  <w:pPr>
+                    <w:spacing w:line="264" w:lineRule="auto"/>
+                    <w:ind w:left="180" w:right="180"/>
+                    <w:rPr>
+                      <w:rFonts w:ascii="Arial" w:eastAsia="Arial" w:hAnsi="Arial" w:cs="Arial"/>
+                      <w:b/>
+                      <w:bCs/>
+                      <w:color w:val="FFFFFF"/>
+                      <w:sz w:val="30"/>
+                      <w:szCs w:val="30"/>
+                    </w:rPr>
+                  </w:pPr>
+                  <w:r>
+                    <w:rPr>
+                      <w:rFonts w:ascii="Arial" w:eastAsia="Arial" w:hAnsi="Arial" w:cs="Arial"/>
+                      <w:b/>
+                      <w:bCs/>
+                      <w:color w:val="FFFFFF"/>
+                      <w:sz w:val="22"/>
+                      <w:szCs w:val="22"/>
+                    </w:rPr>
+                    <w:t>The vendor promised _______, delivered _______, and invoiced us for _______.</w:t>
+                  </w:r>
+                </w:p>
+              </w:tc>
               <w:tc>
                 <w:tcPr>
                   <w:tcW w:w="3600" w:type="dxa"/>
@@ -1854,6 +2372,105 @@
               <w:trPr>
                 <w:trHeight w:hRule="exact" w:val="910"/>
               </w:trPr>
+              <w:tc>
+                <w:tcPr>
+                  <w:tcW w:w="3600" w:type="dxa"/>
+                  <w:tcBorders>
+                    <w:top w:val="none" w:sz="0" w:space="0" w:color="FFFFFF"/>
+                    <w:left w:val="none" w:sz="0" w:space="0" w:color="FFFFFF"/>
+                    <w:bottom w:val="none" w:sz="0" w:space="0" w:color="FFFFFF"/>
+                    <w:right w:val="none" w:sz="0" w:space="0" w:color="FFFFFF"/>
+                  </w:tcBorders>
+                  <w:shd w:val="clear" w:color="auto" w:fill="000000"/>
+                  <w:vAlign w:val="bottom"/>
+                </w:tcPr>
+                <w:p>
+                  <w:pPr>
+                    <w:tabs>
+                      <w:tab w:val="right" w:pos="3220"/>
+                    </w:tabs>
+                    <w:rPr>
+                      <w:noProof/>
+                    </w:rPr>
+                  </w:pPr>
+                  <w:r>
+                    <w:rPr>
+                      <w:noProof/>
+                    </w:rPr>
+                    <w:drawing>
+                      <wp:inline distT="0" distB="0" distL="0" distR="0" wp14:anchorId="0314594A" wp14:editId="3EB20F06">
+                        <wp:extent cx="276225" cy="276225"/>
+                        <wp:effectExtent l="0" t="0" r="0" b="0"/>
+                        <wp:docPr id="408849819" name="Picture 408849819"/>
+                        <wp:cNvGraphicFramePr>
+                          <a:graphicFrameLocks xmlns:a="http://schemas.openxmlformats.org/drawingml/2006/main" noChangeAspect="1"/>
+                        </wp:cNvGraphicFramePr>
+                        <a:graphic xmlns:a="http://schemas.openxmlformats.org/drawingml/2006/main">
+                          <a:graphicData uri="http://schemas.openxmlformats.org/drawingml/2006/picture">
+                            <pic:pic xmlns:pic="http://schemas.openxmlformats.org/drawingml/2006/picture">
+                              <pic:nvPicPr>
+                                <pic:cNvPr id="0" name=""/>
+                                <pic:cNvPicPr>
+                                  <a:picLocks noChangeAspect="1" noChangeArrowheads="1"/>
+                                </pic:cNvPicPr>
+                              </pic:nvPicPr>
+                              <pic:blipFill>
+                                <a:blip r:embed="rId5"/>
+                                <a:srcRect/>
+                                <a:stretch>
+                                  <a:fillRect/>
+                                </a:stretch>
+                              </pic:blipFill>
+                              <pic:spPr bwMode="auto">
+                                <a:xfrm>
+                                  <a:off x="0" y="0"/>
+                                  <a:ext cx="276225" cy="276225"/>
+                                </a:xfrm>
+                                <a:prstGeom prst="rect">
+                                  <a:avLst/>
+                                </a:prstGeom>
+                              </pic:spPr>
+                            </pic:pic>
+                          </a:graphicData>
+                        </a:graphic>
+                      </wp:inline>
+                    </w:drawing>
+                  </w:r>
+                  <w:r>
+                    <w:rPr>
+                      <w:rFonts w:ascii="Arial" w:eastAsia="Arial" w:hAnsi="Arial" w:cs="Arial"/>
+                      <w:sz w:val="13"/>
+                      <w:szCs w:val="13"/>
+                    </w:rPr>
+                    <w:t xml:space="preserve">  </w:t>
+                  </w:r>
+                  <w:r>
+                    <w:rPr>
+                      <w:rFonts w:ascii="Arial" w:eastAsia="Arial" w:hAnsi="Arial" w:cs="Arial"/>
+                      <w:b/>
+                      <w:bCs/>
+                      <w:color w:val="B0B0B0"/>
+                      <w:sz w:val="12"/>
+                      <w:szCs w:val="12"/>
+                    </w:rPr>
+                    <w:t>CARDS AGAINST THE CLOUD</w:t>
+                  </w:r>
+                  <w:r>
+                    <w:tab/>
+                  </w:r>
+                  <w:r>
+                    <w:rPr>
+                      <w:rFonts w:ascii="Arial" w:eastAsia="Arial" w:hAnsi="Arial" w:cs="Arial"/>
+                      <w:b/>
+                      <w:bCs/>
+                      <w:color w:val="FFFFFF"/>
+                      <w:sz w:val="16"/>
+                      <w:szCs w:val="16"/>
+                    </w:rPr>
+                    <w:t>PICK 3</w:t>
+                  </w:r>
+                </w:p>
+              </w:tc>
               <w:tc>
                 <w:tcPr>
                   <w:tcW w:w="3600" w:type="dxa"/>

</xml_diff>